<commit_message>
docs: aggiorna la Project Plan Review — gap sul tracker risolto
Le issue #15, #17, #18, #19 sono state chiuse su GitHub (25/08, tutte
state_reason: completed) — il finding piu' persistente delle tre
revisioni precedenti non esiste piu'. Aggiornamenti:

- Stat rail: sostituita la statistica di allarme con una positiva
  (0/4 issue chiuse nei fatti ma aperte, in verde).
- Findings rinumerati: rimane il rischio di sicurezza in cima (#35,
  invariato), seguito solo dagli ultimi residui (mappa documenti
  CLAUDE.md, issue #4, CALIPER_CPU_LIMIT_S).
- Backlog ridotto da dieci a sei issue aperte, coerente col tracker
  reale; tabella milestone aggiornata con le pillole "chiusa".
- Raccomandazioni consolidate da quattro a tre orizzonti, rimossa la
  voce "chiudere formalmente le issue" ormai fatta.
</commit_message>
<xml_diff>
--- a/docs/project_plan_review_2026-08-25.docx
+++ b/docs/project_plan_review_2026-08-25.docx
@@ -103,7 +103,7 @@
                 <w:sz w:val="19"/>
                 <w:szCs w:val="19"/>
               </w:rPr>
-              <w:t xml:space="preserve">2026-08-25 · rev.3</w:t>
+              <w:t xml:space="preserve">2026-08-25 · rev.4</w:t>
             </w:r>
           </w:p>
         </w:tc>
@@ -479,11 +479,11 @@
                 <w:rFonts w:ascii="Consolas" w:cs="Consolas" w:eastAsia="Consolas" w:hAnsi="Consolas"/>
                 <w:b/>
                 <w:bCs/>
-                <w:color w:val="93650E"/>
+                <w:color w:val="2E7D4F"/>
                 <w:sz w:val="19"/>
                 <w:szCs w:val="19"/>
               </w:rPr>
-              <w:t xml:space="preserve">→  </w:t>
+              <w:t xml:space="preserve">✓  </w:t>
             </w:r>
             <w:r>
               <w:rPr>
@@ -494,7 +494,7 @@
                 <w:sz w:val="19"/>
                 <w:szCs w:val="19"/>
               </w:rPr>
-              <w:t xml:space="preserve">Il gap sul tracker resta invariato — </w:t>
+              <w:t xml:space="preserve">Il gap sul tracker è risolto — </w:t>
             </w:r>
             <w:r>
               <w:rPr>
@@ -503,7 +503,7 @@
                 <w:sz w:val="19"/>
                 <w:szCs w:val="19"/>
               </w:rPr>
-              <w:t xml:space="preserve">ancora le stesse 4 issue chiuse nei fatti ma aperte su GitHub (#15, #17, #18, #19); #35 e #36 sono aperture legittime.</w:t>
+              <w:t xml:space="preserve">#15, #17, #18, #19 chiuse su GitHub (25/08, 20:26, tutte state_reason: completed, chiuse dall'utente stesso). Il finding più persistente delle tre revisioni precedenti non esiste più.</w:t>
             </w:r>
           </w:p>
         </w:tc>
@@ -652,11 +652,11 @@
                 <w:rFonts w:ascii="Consolas" w:cs="Consolas" w:eastAsia="Consolas" w:hAnsi="Consolas"/>
                 <w:b/>
                 <w:bCs/>
-                <w:color w:val="93650E"/>
+                <w:color w:val="2E7D4F"/>
                 <w:sz w:val="30"/>
                 <w:szCs w:val="30"/>
               </w:rPr>
-              <w:t xml:space="preserve">4</w:t>
+              <w:t xml:space="preserve">0/4</w:t>
             </w:r>
           </w:p>
           <w:p>
@@ -667,7 +667,7 @@
                 <w:sz w:val="15"/>
                 <w:szCs w:val="15"/>
               </w:rPr>
-              <w:t xml:space="preserve">issue di milestone chiuse nei fatti (#15, #17, #18, #19) ma ancora aperte su GitHub</w:t>
+              <w:t xml:space="preserve">issue chiuse nei fatti ma aperte su GitHub — #15/#17/#18/#19 chiuse oggi, gap risolto</w:t>
             </w:r>
           </w:p>
         </w:tc>
@@ -968,7 +968,7 @@
             <w:vAlign w:val="top"/>
           </w:tcPr>
           <w:p>
-            <w:hyperlink w:history="1" r:id="rIdchlwn29dq8ra38nsgl9kd">
+            <w:hyperlink w:history="1" r:id="rId3bixky9dbilkeyvmdafth">
               <w:r>
                 <w:rPr>
                   <w:rFonts w:ascii="Consolas" w:cs="Consolas" w:eastAsia="Consolas" w:hAnsi="Consolas"/>
@@ -1093,7 +1093,7 @@
             <w:vAlign w:val="top"/>
           </w:tcPr>
           <w:p>
-            <w:hyperlink w:history="1" r:id="rIdd-xovouiakz3a4uyrnbtv">
+            <w:hyperlink w:history="1" r:id="rIdvacndxfv6cb4t6r2xafsc">
               <w:r>
                 <w:rPr>
                   <w:rFonts w:ascii="Consolas" w:cs="Consolas" w:eastAsia="Consolas" w:hAnsi="Consolas"/>
@@ -1218,7 +1218,7 @@
             <w:vAlign w:val="top"/>
           </w:tcPr>
           <w:p>
-            <w:hyperlink w:history="1" r:id="rId_25bhj3wpzwa8kbpdtgmw">
+            <w:hyperlink w:history="1" r:id="rIdcgekpfap2vbyx9erb029y">
               <w:r>
                 <w:rPr>
                   <w:rFonts w:ascii="Consolas" w:cs="Consolas" w:eastAsia="Consolas" w:hAnsi="Consolas"/>
@@ -1361,7 +1361,7 @@
             <w:vAlign w:val="top"/>
           </w:tcPr>
           <w:p>
-            <w:hyperlink w:history="1" r:id="rIdwqlh9ode-9jlzssdoyrzg">
+            <w:hyperlink w:history="1" r:id="rId2rza9dduyz-busbds_yx1">
               <w:r>
                 <w:rPr>
                   <w:rFonts w:ascii="Consolas" w:cs="Consolas" w:eastAsia="Consolas" w:hAnsi="Consolas"/>
@@ -1486,7 +1486,7 @@
             <w:vAlign w:val="top"/>
           </w:tcPr>
           <w:p>
-            <w:hyperlink w:history="1" r:id="rIdq6wtauduu4er0lq0pm36x">
+            <w:hyperlink w:history="1" r:id="rIdlnnamzxwsvjdxcrzmlr9f">
               <w:r>
                 <w:rPr>
                   <w:rFonts w:ascii="Consolas" w:cs="Consolas" w:eastAsia="Consolas" w:hAnsi="Consolas"/>
@@ -1523,11 +1523,11 @@
                 <w:rFonts w:ascii="Consolas" w:cs="Consolas" w:eastAsia="Consolas" w:hAnsi="Consolas"/>
                 <w:b/>
                 <w:bCs/>
-                <w:color w:val="93650E"/>
+                <w:color w:val="2E7D4F"/>
                 <w:sz w:val="16"/>
                 <w:szCs w:val="16"/>
               </w:rPr>
-              <w:t xml:space="preserve">APERTA SU GH</w:t>
+              <w:t xml:space="preserve">CHIUSA</w:t>
             </w:r>
           </w:p>
         </w:tc>
@@ -1556,7 +1556,7 @@
                 <w:sz w:val="18"/>
                 <w:szCs w:val="18"/>
               </w:rPr>
-              <w:t xml:space="preserve">Review tecnica critica: deliverable prodotto (review_tecnica.md), C1–C11 trovate, 7 proposte P1–P7. Lavoro concluso, issue ancora aperta.</w:t>
+              <w:t xml:space="preserve">Review tecnica critica: deliverable prodotto (review_tecnica.md), C1–C11 trovate, 7 proposte P1–P7. Chiusa il 25/08 (completed), dopo giorni aperta nonostante il lavoro concluso.</w:t>
             </w:r>
           </w:p>
         </w:tc>
@@ -1611,7 +1611,7 @@
             <w:vAlign w:val="top"/>
           </w:tcPr>
           <w:p>
-            <w:hyperlink w:history="1" r:id="rIdp5_y90lxfu5evil0yvrlx">
+            <w:hyperlink w:history="1" r:id="rIdlmojguhqos4j1ixi-5nwu">
               <w:r>
                 <w:rPr>
                   <w:rFonts w:ascii="Consolas" w:cs="Consolas" w:eastAsia="Consolas" w:hAnsi="Consolas"/>
@@ -1648,11 +1648,11 @@
                 <w:rFonts w:ascii="Consolas" w:cs="Consolas" w:eastAsia="Consolas" w:hAnsi="Consolas"/>
                 <w:b/>
                 <w:bCs/>
-                <w:color w:val="93650E"/>
+                <w:color w:val="2E7D4F"/>
                 <w:sz w:val="16"/>
                 <w:szCs w:val="16"/>
               </w:rPr>
-              <w:t xml:space="preserve">APERTA SU GH</w:t>
+              <w:t xml:space="preserve">CHIUSA</w:t>
             </w:r>
           </w:p>
         </w:tc>
@@ -1681,7 +1681,7 @@
                 <w:sz w:val="18"/>
                 <w:szCs w:val="18"/>
               </w:rPr>
-              <w:t xml:space="preserve">C1–C7, C10 chiusi in sandbox — 8 test rosso→verde, mergiata in develop. C8 rimandato esplicitamente, poi chiuso in M6/M7.</w:t>
+              <w:t xml:space="preserve">C1–C7, C10 chiusi in sandbox — 8 test rosso→verde, mergiata in develop. C8 rimandato esplicitamente, poi chiuso in M6/M7. Issue chiusa il 25/08.</w:t>
             </w:r>
           </w:p>
         </w:tc>
@@ -1736,7 +1736,7 @@
             <w:vAlign w:val="top"/>
           </w:tcPr>
           <w:p>
-            <w:hyperlink w:history="1" r:id="rIdzwh56ccl7ngf9wq3ulkvp">
+            <w:hyperlink w:history="1" r:id="rId4wf4supcyccjonfiblwkz">
               <w:r>
                 <w:rPr>
                   <w:rFonts w:ascii="Consolas" w:cs="Consolas" w:eastAsia="Consolas" w:hAnsi="Consolas"/>
@@ -1773,11 +1773,11 @@
                 <w:rFonts w:ascii="Consolas" w:cs="Consolas" w:eastAsia="Consolas" w:hAnsi="Consolas"/>
                 <w:b/>
                 <w:bCs/>
-                <w:color w:val="93650E"/>
+                <w:color w:val="2E7D4F"/>
                 <w:sz w:val="16"/>
                 <w:szCs w:val="16"/>
               </w:rPr>
-              <w:t xml:space="preserve">APERTA SU GH</w:t>
+              <w:t xml:space="preserve">CHIUSA</w:t>
             </w:r>
           </w:p>
         </w:tc>
@@ -1806,7 +1806,7 @@
                 <w:sz w:val="18"/>
                 <w:szCs w:val="18"/>
               </w:rPr>
-              <w:t xml:space="preserve">9/9 TC-E2E su RunPod: primo PASS end-to-end reale, SIGSEGV risolto strutturalmente, C2/C6/C8 confermati dal vivo. Commento di chiusura pubblicato, issue non ancora chiusa.</w:t>
+              <w:t xml:space="preserve">9/9 TC-E2E su RunPod: primo PASS end-to-end reale, SIGSEGV risolto strutturalmente, C2/C6/C8 confermati dal vivo. Chiusa il 25/08.</w:t>
             </w:r>
           </w:p>
         </w:tc>
@@ -1861,7 +1861,7 @@
             <w:vAlign w:val="top"/>
           </w:tcPr>
           <w:p>
-            <w:hyperlink w:history="1" r:id="rIdiv-hredovpwftugcur8ga">
+            <w:hyperlink w:history="1" r:id="rId4rhz16pghtprqy9bcmknt">
               <w:r>
                 <w:rPr>
                   <w:rFonts w:ascii="Consolas" w:cs="Consolas" w:eastAsia="Consolas" w:hAnsi="Consolas"/>
@@ -1898,11 +1898,11 @@
                 <w:rFonts w:ascii="Consolas" w:cs="Consolas" w:eastAsia="Consolas" w:hAnsi="Consolas"/>
                 <w:b/>
                 <w:bCs/>
-                <w:color w:val="93650E"/>
+                <w:color w:val="2E7D4F"/>
                 <w:sz w:val="16"/>
                 <w:szCs w:val="16"/>
               </w:rPr>
-              <w:t xml:space="preserve">APERTA SU GH</w:t>
+              <w:t xml:space="preserve">CHIUSA</w:t>
             </w:r>
           </w:p>
         </w:tc>
@@ -1949,7 +1949,7 @@
                 <w:sz w:val="18"/>
                 <w:szCs w:val="18"/>
               </w:rPr>
-              <w:t xml:space="preserve">). 6 bug reali trovati e fissati — stesso pattern C9 di M6. PR #31 mergiata dall'utente lo stesso giorno del gate.</w:t>
+              <w:t xml:space="preserve">). 6 bug reali trovati e fissati — stesso pattern C9 di M6. PR #31 mergiata e issue chiusa dall'utente lo stesso giorno del gate.</w:t>
             </w:r>
           </w:p>
         </w:tc>
@@ -2004,7 +2004,7 @@
             <w:vAlign w:val="top"/>
           </w:tcPr>
           <w:p>
-            <w:hyperlink w:history="1" r:id="rId2n-eds_ssx3ey1mfymkow">
+            <w:hyperlink w:history="1" r:id="rIdvezf4mp_aqq4glpcqm6oo">
               <w:r>
                 <w:rPr>
                   <w:rFonts w:ascii="Consolas" w:cs="Consolas" w:eastAsia="Consolas" w:hAnsi="Consolas"/>
@@ -2500,7 +2500,7 @@
           <w:sz w:val="22"/>
           <w:szCs w:val="22"/>
         </w:rPr>
-        <w:t xml:space="preserve">Un rischio concreto, e i soliti gap di processo</w:t>
+        <w:t xml:space="preserve">Un rischio concreto, e gli ultimi residui</w:t>
       </w:r>
     </w:p>
     <w:p>
@@ -2514,7 +2514,7 @@
           <w:sz w:val="19"/>
           <w:szCs w:val="19"/>
         </w:rPr>
-        <w:t xml:space="preserve">Il finding 01 è diverso dagli altri: non è un gap di sincronizzazione, è un'esposizione con un costo reale, già dichiarata dal progetto stesso in issue #35. I finding 02-05 restano invece la stessa categoria della revisione precedente — la maggior parte (README, index.html, logbook.md, CLAUDE.md) è stata risolta nel frattempo; quelli elencati qui sono i residui.</w:t>
+        <w:t xml:space="preserve">Il finding 01 è diverso dagli altri: non è un gap di sincronizzazione, è un'esposizione con un costo reale, già dichiarata dal progetto stesso in issue #35. I finding 02-04 sono gli ultimi residui della stessa categoria che ha dominato le due revisioni precedenti — quella più grande e più persistente (il tracker disallineato dal lavoro reale) è stata chiusa oggi stesso.</w:t>
       </w:r>
     </w:p>
     <w:p>
@@ -2583,7 +2583,7 @@
           <w:sz w:val="20"/>
           <w:szCs w:val="20"/>
         </w:rPr>
-        <w:t xml:space="preserve">Il gap sul tracker resta invariato: quattro issue di milestone chiuse nei fatti restano aperte su GitHub</w:t>
+        <w:t xml:space="preserve">La mappa dei documenti di CLAUDE.md non copre ancora M7 né “Prompt to Part”</w:t>
       </w:r>
     </w:p>
     <w:p>
@@ -2598,7 +2598,7 @@
           <w:sz w:val="19"/>
           <w:szCs w:val="19"/>
         </w:rPr>
-        <w:t xml:space="preserve">Nessun cambiamento dalla versione precedente: #15 (review), #17 (M5), #18 (M6), #19 (M7) hanno tutte un deliverable completo o una PR mergiata con criterio dichiarato soddisfatto, ma nessuna è stata chiusa come issue. Le due nuove issue di oggi (#35, #36) sono aperture legittime, non altri esempi dello stesso problema — ma portano il totale a 10 issue aperte, di cui solo 3 realmente attive (#20, #35, #36).</w:t>
+        <w:t xml:space="preserve">La sezione “Stato del progetto” di CLAUDE.md è oggi accurata (PR #32 l'ha riallineata subito) — ma la tabella “Mappa dei documenti”, pensata per orientare una sessione futura, non ha ancora una riga per logbook_fase7.md/report_m7_run0.md, né per dashboard app.py/prompt-to-part.html o l'issue di sicurezza #35. Un gap piccolo, ma la stessa categoria.</w:t>
       </w:r>
     </w:p>
     <w:p>
@@ -2625,7 +2625,7 @@
           <w:sz w:val="20"/>
           <w:szCs w:val="20"/>
         </w:rPr>
-        <w:t xml:space="preserve">La mappa dei documenti di CLAUDE.md non copre ancora M7 né “Prompt to Part”</w:t>
+        <w:t xml:space="preserve">Issue #4 (M3) non riflette ancora la decisione presa in M5</w:t>
       </w:r>
     </w:p>
     <w:p>
@@ -2640,7 +2640,7 @@
           <w:sz w:val="19"/>
           <w:szCs w:val="19"/>
         </w:rPr>
-        <w:t xml:space="preserve">La sezione “Stato del progetto” di CLAUDE.md è oggi accurata (PR #32 l'ha riallineata subito) — ma la tabella “Mappa dei documenti”, pensata per orientare una sessione futura, non ha ancora una riga per logbook_fase7.md/report_m7_run0.md, né per dashboard app.py/prompt-to-part.html o l'issue di sicurezza #35. Un gap più piccolo del precedente, ma la stessa categoria.</w:t>
+        <w:t xml:space="preserve">Il criterio originale di #4 era un E2E reale con la pipeline sketch-first. M5 ha reso param_first il default e sia M6 sia M7 hanno ottenuto PASS reali proprio con param_first, non con lo sketch-first di M3. Invariato dall'ultima versione di questa review.</w:t>
       </w:r>
     </w:p>
     <w:p>
@@ -2657,48 +2657,6 @@
           <w:szCs w:val="20"/>
         </w:rPr>
         <w:t xml:space="preserve">04   </w:t>
-      </w:r>
-      <w:r>
-        <w:rPr>
-          <w:rFonts w:ascii="Georgia" w:cs="Georgia" w:eastAsia="Georgia" w:hAnsi="Georgia"/>
-          <w:b/>
-          <w:bCs/>
-          <w:color w:val="17262A"/>
-          <w:sz w:val="20"/>
-          <w:szCs w:val="20"/>
-        </w:rPr>
-        <w:t xml:space="preserve">Issue #4 (M3) non riflette ancora la decisione presa in M5</w:t>
-      </w:r>
-    </w:p>
-    <w:p>
-      <w:pPr>
-        <w:spacing w:after="60"/>
-        <w:ind w:left="260"/>
-      </w:pPr>
-      <w:r>
-        <w:rPr>
-          <w:rFonts w:ascii="Georgia" w:cs="Georgia" w:eastAsia="Georgia" w:hAnsi="Georgia"/>
-          <w:color w:val="4C5F60"/>
-          <w:sz w:val="19"/>
-          <w:szCs w:val="19"/>
-        </w:rPr>
-        <w:t xml:space="preserve">Il criterio originale di #4 era un E2E reale con la pipeline sketch-first. M5 ha reso param_first il default e sia M6 sia M7 hanno ottenuto PASS reali proprio con param_first, non con lo sketch-first di M3. Invariato dall'ultima versione di questa review.</w:t>
-      </w:r>
-    </w:p>
-    <w:p>
-      <w:pPr>
-        <w:spacing w:after="40" w:before="200"/>
-      </w:pPr>
-      <w:r>
-        <w:rPr>
-          <w:rFonts w:ascii="Consolas" w:cs="Consolas" w:eastAsia="Consolas" w:hAnsi="Consolas"/>
-          <w:b/>
-          <w:bCs/>
-          <w:color w:val="1B6E73"/>
-          <w:sz w:val="20"/>
-          <w:szCs w:val="20"/>
-        </w:rPr>
-        <w:t xml:space="preserve">05   </w:t>
       </w:r>
       <w:r>
         <w:rPr>
@@ -2758,7 +2716,7 @@
           <w:sz w:val="22"/>
           <w:szCs w:val="22"/>
         </w:rPr>
-        <w:t xml:space="preserve">Le dieci issue oggi aperte su GitHub</w:t>
+        <w:t xml:space="preserve">Le sei issue oggi aperte su GitHub</w:t>
       </w:r>
     </w:p>
     <w:p>
@@ -2772,7 +2730,7 @@
           <w:sz w:val="19"/>
           <w:szCs w:val="19"/>
         </w:rPr>
-        <w:t xml:space="preserve">Vista unificata, con una lettura di priorità reale — non l'ordine numerico delle issue. Due nuove da oggi (#35, #36), entrambe aperture legittime, non gap di tracker.</w:t>
+        <w:t xml:space="preserve">Erano dieci fino a poco fa: #15, #17, #18, #19 sono state chiuse oggi stesso (tutte completed), quindi il backlog qui sotto ora coincide con quello reale.</w:t>
       </w:r>
     </w:p>
     <w:tbl>
@@ -2945,7 +2903,7 @@
             <w:vAlign w:val="top"/>
           </w:tcPr>
           <w:p>
-            <w:hyperlink w:history="1" r:id="rIdw0poftxnc8-lvyzplevk4">
+            <w:hyperlink w:history="1" r:id="rId23aa1iylmx5zgqpbkycdp">
               <w:r>
                 <w:rPr>
                   <w:rFonts w:ascii="Consolas" w:cs="Consolas" w:eastAsia="Consolas" w:hAnsi="Consolas"/>
@@ -3068,7 +3026,7 @@
             <w:vAlign w:val="top"/>
           </w:tcPr>
           <w:p>
-            <w:hyperlink w:history="1" r:id="rIdz0u4uf9i9yt63n0gunfw0">
+            <w:hyperlink w:history="1" r:id="rId5hedljr8ieoeisurzk3na">
               <w:r>
                 <w:rPr>
                   <w:rFonts w:ascii="Consolas" w:cs="Consolas" w:eastAsia="Consolas" w:hAnsi="Consolas"/>
@@ -3191,7 +3149,7 @@
             <w:vAlign w:val="top"/>
           </w:tcPr>
           <w:p>
-            <w:hyperlink w:history="1" r:id="rIdekn6m3pgmus9c57os3php">
+            <w:hyperlink w:history="1" r:id="rIdsif0sq75gjoi3t3e-tcyw">
               <w:r>
                 <w:rPr>
                   <w:rFonts w:ascii="Consolas" w:cs="Consolas" w:eastAsia="Consolas" w:hAnsi="Consolas"/>
@@ -3314,499 +3272,7 @@
             <w:vAlign w:val="top"/>
           </w:tcPr>
           <w:p>
-            <w:hyperlink w:history="1" r:id="rIdtkbq0eifljh8y4_acrmwr">
-              <w:r>
-                <w:rPr>
-                  <w:rFonts w:ascii="Consolas" w:cs="Consolas" w:eastAsia="Consolas" w:hAnsi="Consolas"/>
-                  <w:color w:val="0E4A4F"/>
-                  <w:sz w:val="19"/>
-                  <w:szCs w:val="19"/>
-                  <w:u w:val="single"/>
-                </w:rPr>
-                <w:t xml:space="preserve">#19</w:t>
-              </w:r>
-            </w:hyperlink>
-          </w:p>
-        </w:tc>
-        <w:tc>
-          <w:tcPr>
-            <w:tcW w:type="dxa" w:w="2600"/>
-            <w:tcBorders>
-              <w:top w:val="single" w:color="CBD6D3" w:sz="4"/>
-              <w:left w:val="single" w:color="CBD6D3" w:sz="4"/>
-              <w:bottom w:val="single" w:color="CBD6D3" w:sz="4"/>
-              <w:right w:val="single" w:color="CBD6D3" w:sz="4"/>
-            </w:tcBorders>
-            <w:tcMar>
-              <w:top w:type="dxa" w:w="100"/>
-              <w:left w:type="dxa" w:w="120"/>
-              <w:bottom w:type="dxa" w:w="100"/>
-              <w:right w:type="dxa" w:w="120"/>
-            </w:tcMar>
-            <w:vAlign w:val="top"/>
-          </w:tcPr>
-          <w:p>
-            <w:r>
-              <w:rPr>
-                <w:rFonts w:ascii="Georgia" w:cs="Georgia" w:eastAsia="Georgia" w:hAnsi="Georgia"/>
-                <w:color w:val="17262A"/>
-                <w:sz w:val="18"/>
-                <w:szCs w:val="18"/>
-              </w:rPr>
-              <w:t xml:space="preserve">M7 — topologia Docker reale, RTX 3090</w:t>
-            </w:r>
-          </w:p>
-        </w:tc>
-        <w:tc>
-          <w:tcPr>
-            <w:tcW w:type="dxa" w:w="1500"/>
-            <w:tcBorders>
-              <w:top w:val="single" w:color="CBD6D3" w:sz="4"/>
-              <w:left w:val="single" w:color="CBD6D3" w:sz="4"/>
-              <w:bottom w:val="single" w:color="CBD6D3" w:sz="4"/>
-              <w:right w:val="single" w:color="CBD6D3" w:sz="4"/>
-            </w:tcBorders>
-            <w:tcMar>
-              <w:top w:type="dxa" w:w="100"/>
-              <w:left w:type="dxa" w:w="120"/>
-              <w:bottom w:type="dxa" w:w="100"/>
-              <w:right w:type="dxa" w:w="120"/>
-            </w:tcMar>
-            <w:vAlign w:val="top"/>
-          </w:tcPr>
-          <w:p>
-            <w:r>
-              <w:rPr>
-                <w:rFonts w:ascii="Consolas" w:cs="Consolas" w:eastAsia="Consolas" w:hAnsi="Consolas"/>
-                <w:b/>
-                <w:bCs/>
-                <w:color w:val="4C5F60"/>
-                <w:sz w:val="16"/>
-                <w:szCs w:val="16"/>
-              </w:rPr>
-              <w:t xml:space="preserve">CHIUSURA AMMINISTRATIVA</w:t>
-            </w:r>
-          </w:p>
-        </w:tc>
-        <w:tc>
-          <w:tcPr>
-            <w:tcW w:type="dxa" w:w="4360"/>
-            <w:tcBorders>
-              <w:top w:val="single" w:color="CBD6D3" w:sz="4"/>
-              <w:left w:val="single" w:color="CBD6D3" w:sz="4"/>
-              <w:bottom w:val="single" w:color="CBD6D3" w:sz="4"/>
-              <w:right w:val="single" w:color="CBD6D3" w:sz="4"/>
-            </w:tcBorders>
-            <w:tcMar>
-              <w:top w:type="dxa" w:w="100"/>
-              <w:left w:type="dxa" w:w="120"/>
-              <w:bottom w:type="dxa" w:w="100"/>
-              <w:right w:type="dxa" w:w="120"/>
-            </w:tcMar>
-            <w:vAlign w:val="top"/>
-          </w:tcPr>
-          <w:p>
-            <w:r>
-              <w:rPr>
-                <w:rFonts w:ascii="Georgia" w:cs="Georgia" w:eastAsia="Georgia" w:hAnsi="Georgia"/>
-                <w:color w:val="4C5F60"/>
-                <w:sz w:val="18"/>
-                <w:szCs w:val="18"/>
-              </w:rPr>
-              <w:t xml:space="preserve">Criterio soddisfatto, PR #31 mergiata (2026-08-25). Chiudere con riferimento al PR e al primo G-code prodotto.</w:t>
-            </w:r>
-          </w:p>
-        </w:tc>
-      </w:tr>
-      <w:tr>
-        <w:tc>
-          <w:tcPr>
-            <w:tcW w:type="dxa" w:w="900"/>
-            <w:tcBorders>
-              <w:top w:val="single" w:color="CBD6D3" w:sz="4"/>
-              <w:left w:val="single" w:color="CBD6D3" w:sz="4"/>
-              <w:bottom w:val="single" w:color="CBD6D3" w:sz="4"/>
-              <w:right w:val="single" w:color="CBD6D3" w:sz="4"/>
-            </w:tcBorders>
-            <w:tcMar>
-              <w:top w:type="dxa" w:w="100"/>
-              <w:left w:type="dxa" w:w="120"/>
-              <w:bottom w:type="dxa" w:w="100"/>
-              <w:right w:type="dxa" w:w="120"/>
-            </w:tcMar>
-            <w:vAlign w:val="top"/>
-          </w:tcPr>
-          <w:p>
-            <w:hyperlink w:history="1" r:id="rIdtnf7db4joprz4hugo-4x4">
-              <w:r>
-                <w:rPr>
-                  <w:rFonts w:ascii="Consolas" w:cs="Consolas" w:eastAsia="Consolas" w:hAnsi="Consolas"/>
-                  <w:color w:val="0E4A4F"/>
-                  <w:sz w:val="19"/>
-                  <w:szCs w:val="19"/>
-                  <w:u w:val="single"/>
-                </w:rPr>
-                <w:t xml:space="preserve">#18</w:t>
-              </w:r>
-            </w:hyperlink>
-          </w:p>
-        </w:tc>
-        <w:tc>
-          <w:tcPr>
-            <w:tcW w:type="dxa" w:w="2600"/>
-            <w:tcBorders>
-              <w:top w:val="single" w:color="CBD6D3" w:sz="4"/>
-              <w:left w:val="single" w:color="CBD6D3" w:sz="4"/>
-              <w:bottom w:val="single" w:color="CBD6D3" w:sz="4"/>
-              <w:right w:val="single" w:color="CBD6D3" w:sz="4"/>
-            </w:tcBorders>
-            <w:tcMar>
-              <w:top w:type="dxa" w:w="100"/>
-              <w:left w:type="dxa" w:w="120"/>
-              <w:bottom w:type="dxa" w:w="100"/>
-              <w:right w:type="dxa" w:w="120"/>
-            </w:tcMar>
-            <w:vAlign w:val="top"/>
-          </w:tcPr>
-          <w:p>
-            <w:r>
-              <w:rPr>
-                <w:rFonts w:ascii="Georgia" w:cs="Georgia" w:eastAsia="Georgia" w:hAnsi="Georgia"/>
-                <w:color w:val="17262A"/>
-                <w:sz w:val="18"/>
-                <w:szCs w:val="18"/>
-              </w:rPr>
-              <w:t xml:space="preserve">M6 — bring-up RunPod</w:t>
-            </w:r>
-          </w:p>
-        </w:tc>
-        <w:tc>
-          <w:tcPr>
-            <w:tcW w:type="dxa" w:w="1500"/>
-            <w:tcBorders>
-              <w:top w:val="single" w:color="CBD6D3" w:sz="4"/>
-              <w:left w:val="single" w:color="CBD6D3" w:sz="4"/>
-              <w:bottom w:val="single" w:color="CBD6D3" w:sz="4"/>
-              <w:right w:val="single" w:color="CBD6D3" w:sz="4"/>
-            </w:tcBorders>
-            <w:tcMar>
-              <w:top w:type="dxa" w:w="100"/>
-              <w:left w:type="dxa" w:w="120"/>
-              <w:bottom w:type="dxa" w:w="100"/>
-              <w:right w:type="dxa" w:w="120"/>
-            </w:tcMar>
-            <w:vAlign w:val="top"/>
-          </w:tcPr>
-          <w:p>
-            <w:r>
-              <w:rPr>
-                <w:rFonts w:ascii="Consolas" w:cs="Consolas" w:eastAsia="Consolas" w:hAnsi="Consolas"/>
-                <w:b/>
-                <w:bCs/>
-                <w:color w:val="4C5F60"/>
-                <w:sz w:val="16"/>
-                <w:szCs w:val="16"/>
-              </w:rPr>
-              <w:t xml:space="preserve">CHIUSURA AMMINISTRATIVA</w:t>
-            </w:r>
-          </w:p>
-        </w:tc>
-        <w:tc>
-          <w:tcPr>
-            <w:tcW w:type="dxa" w:w="4360"/>
-            <w:tcBorders>
-              <w:top w:val="single" w:color="CBD6D3" w:sz="4"/>
-              <w:left w:val="single" w:color="CBD6D3" w:sz="4"/>
-              <w:bottom w:val="single" w:color="CBD6D3" w:sz="4"/>
-              <w:right w:val="single" w:color="CBD6D3" w:sz="4"/>
-            </w:tcBorders>
-            <w:tcMar>
-              <w:top w:type="dxa" w:w="100"/>
-              <w:left w:type="dxa" w:w="120"/>
-              <w:bottom w:type="dxa" w:w="100"/>
-              <w:right w:type="dxa" w:w="120"/>
-            </w:tcMar>
-            <w:vAlign w:val="top"/>
-          </w:tcPr>
-          <w:p>
-            <w:r>
-              <w:rPr>
-                <w:rFonts w:ascii="Georgia" w:cs="Georgia" w:eastAsia="Georgia" w:hAnsi="Georgia"/>
-                <w:color w:val="4C5F60"/>
-                <w:sz w:val="18"/>
-                <w:szCs w:val="18"/>
-              </w:rPr>
-              <w:t xml:space="preserve">Lavoro completo, commento finale pubblicato (“M6 CHIUSA”). Chiudere con riferimento ai PR #21–#28.</w:t>
-            </w:r>
-          </w:p>
-        </w:tc>
-      </w:tr>
-      <w:tr>
-        <w:tc>
-          <w:tcPr>
-            <w:tcW w:type="dxa" w:w="900"/>
-            <w:tcBorders>
-              <w:top w:val="single" w:color="CBD6D3" w:sz="4"/>
-              <w:left w:val="single" w:color="CBD6D3" w:sz="4"/>
-              <w:bottom w:val="single" w:color="CBD6D3" w:sz="4"/>
-              <w:right w:val="single" w:color="CBD6D3" w:sz="4"/>
-            </w:tcBorders>
-            <w:tcMar>
-              <w:top w:type="dxa" w:w="100"/>
-              <w:left w:type="dxa" w:w="120"/>
-              <w:bottom w:type="dxa" w:w="100"/>
-              <w:right w:type="dxa" w:w="120"/>
-            </w:tcMar>
-            <w:vAlign w:val="top"/>
-          </w:tcPr>
-          <w:p>
-            <w:hyperlink w:history="1" r:id="rId92pd6c9gkxopqnew3wa3q">
-              <w:r>
-                <w:rPr>
-                  <w:rFonts w:ascii="Consolas" w:cs="Consolas" w:eastAsia="Consolas" w:hAnsi="Consolas"/>
-                  <w:color w:val="0E4A4F"/>
-                  <w:sz w:val="19"/>
-                  <w:szCs w:val="19"/>
-                  <w:u w:val="single"/>
-                </w:rPr>
-                <w:t xml:space="preserve">#17</w:t>
-              </w:r>
-            </w:hyperlink>
-          </w:p>
-        </w:tc>
-        <w:tc>
-          <w:tcPr>
-            <w:tcW w:type="dxa" w:w="2600"/>
-            <w:tcBorders>
-              <w:top w:val="single" w:color="CBD6D3" w:sz="4"/>
-              <w:left w:val="single" w:color="CBD6D3" w:sz="4"/>
-              <w:bottom w:val="single" w:color="CBD6D3" w:sz="4"/>
-              <w:right w:val="single" w:color="CBD6D3" w:sz="4"/>
-            </w:tcBorders>
-            <w:tcMar>
-              <w:top w:type="dxa" w:w="100"/>
-              <w:left w:type="dxa" w:w="120"/>
-              <w:bottom w:type="dxa" w:w="100"/>
-              <w:right w:type="dxa" w:w="120"/>
-            </w:tcMar>
-            <w:vAlign w:val="top"/>
-          </w:tcPr>
-          <w:p>
-            <w:r>
-              <w:rPr>
-                <w:rFonts w:ascii="Georgia" w:cs="Georgia" w:eastAsia="Georgia" w:hAnsi="Georgia"/>
-                <w:color w:val="17262A"/>
-                <w:sz w:val="18"/>
-                <w:szCs w:val="18"/>
-              </w:rPr>
-              <w:t xml:space="preserve">M5 — fix pack post-review</w:t>
-            </w:r>
-          </w:p>
-        </w:tc>
-        <w:tc>
-          <w:tcPr>
-            <w:tcW w:type="dxa" w:w="1500"/>
-            <w:tcBorders>
-              <w:top w:val="single" w:color="CBD6D3" w:sz="4"/>
-              <w:left w:val="single" w:color="CBD6D3" w:sz="4"/>
-              <w:bottom w:val="single" w:color="CBD6D3" w:sz="4"/>
-              <w:right w:val="single" w:color="CBD6D3" w:sz="4"/>
-            </w:tcBorders>
-            <w:tcMar>
-              <w:top w:type="dxa" w:w="100"/>
-              <w:left w:type="dxa" w:w="120"/>
-              <w:bottom w:type="dxa" w:w="100"/>
-              <w:right w:type="dxa" w:w="120"/>
-            </w:tcMar>
-            <w:vAlign w:val="top"/>
-          </w:tcPr>
-          <w:p>
-            <w:r>
-              <w:rPr>
-                <w:rFonts w:ascii="Consolas" w:cs="Consolas" w:eastAsia="Consolas" w:hAnsi="Consolas"/>
-                <w:b/>
-                <w:bCs/>
-                <w:color w:val="4C5F60"/>
-                <w:sz w:val="16"/>
-                <w:szCs w:val="16"/>
-              </w:rPr>
-              <w:t xml:space="preserve">CHIUSURA AMMINISTRATIVA</w:t>
-            </w:r>
-          </w:p>
-        </w:tc>
-        <w:tc>
-          <w:tcPr>
-            <w:tcW w:type="dxa" w:w="4360"/>
-            <w:tcBorders>
-              <w:top w:val="single" w:color="CBD6D3" w:sz="4"/>
-              <w:left w:val="single" w:color="CBD6D3" w:sz="4"/>
-              <w:bottom w:val="single" w:color="CBD6D3" w:sz="4"/>
-              <w:right w:val="single" w:color="CBD6D3" w:sz="4"/>
-            </w:tcBorders>
-            <w:tcMar>
-              <w:top w:type="dxa" w:w="100"/>
-              <w:left w:type="dxa" w:w="120"/>
-              <w:bottom w:type="dxa" w:w="100"/>
-              <w:right w:type="dxa" w:w="120"/>
-            </w:tcMar>
-            <w:vAlign w:val="top"/>
-          </w:tcPr>
-          <w:p>
-            <w:r>
-              <w:rPr>
-                <w:rFonts w:ascii="Georgia" w:cs="Georgia" w:eastAsia="Georgia" w:hAnsi="Georgia"/>
-                <w:color w:val="4C5F60"/>
-                <w:sz w:val="18"/>
-                <w:szCs w:val="18"/>
-              </w:rPr>
-              <w:t xml:space="preserve">Mergiata in develop, criterio soddisfatto salvo C8 (poi chiuso in M6/M7). Chiudere.</w:t>
-            </w:r>
-          </w:p>
-        </w:tc>
-      </w:tr>
-      <w:tr>
-        <w:tc>
-          <w:tcPr>
-            <w:tcW w:type="dxa" w:w="900"/>
-            <w:tcBorders>
-              <w:top w:val="single" w:color="CBD6D3" w:sz="4"/>
-              <w:left w:val="single" w:color="CBD6D3" w:sz="4"/>
-              <w:bottom w:val="single" w:color="CBD6D3" w:sz="4"/>
-              <w:right w:val="single" w:color="CBD6D3" w:sz="4"/>
-            </w:tcBorders>
-            <w:tcMar>
-              <w:top w:type="dxa" w:w="100"/>
-              <w:left w:type="dxa" w:w="120"/>
-              <w:bottom w:type="dxa" w:w="100"/>
-              <w:right w:type="dxa" w:w="120"/>
-            </w:tcMar>
-            <w:vAlign w:val="top"/>
-          </w:tcPr>
-          <w:p>
-            <w:hyperlink w:history="1" r:id="rId4kemtbilw0vzuhdv3kuid">
-              <w:r>
-                <w:rPr>
-                  <w:rFonts w:ascii="Consolas" w:cs="Consolas" w:eastAsia="Consolas" w:hAnsi="Consolas"/>
-                  <w:color w:val="0E4A4F"/>
-                  <w:sz w:val="19"/>
-                  <w:szCs w:val="19"/>
-                  <w:u w:val="single"/>
-                </w:rPr>
-                <w:t xml:space="preserve">#15</w:t>
-              </w:r>
-            </w:hyperlink>
-          </w:p>
-        </w:tc>
-        <w:tc>
-          <w:tcPr>
-            <w:tcW w:type="dxa" w:w="2600"/>
-            <w:tcBorders>
-              <w:top w:val="single" w:color="CBD6D3" w:sz="4"/>
-              <w:left w:val="single" w:color="CBD6D3" w:sz="4"/>
-              <w:bottom w:val="single" w:color="CBD6D3" w:sz="4"/>
-              <w:right w:val="single" w:color="CBD6D3" w:sz="4"/>
-            </w:tcBorders>
-            <w:tcMar>
-              <w:top w:type="dxa" w:w="100"/>
-              <w:left w:type="dxa" w:w="120"/>
-              <w:bottom w:type="dxa" w:w="100"/>
-              <w:right w:type="dxa" w:w="120"/>
-            </w:tcMar>
-            <w:vAlign w:val="top"/>
-          </w:tcPr>
-          <w:p>
-            <w:r>
-              <w:rPr>
-                <w:rFonts w:ascii="Georgia" w:cs="Georgia" w:eastAsia="Georgia" w:hAnsi="Georgia"/>
-                <w:color w:val="17262A"/>
-                <w:sz w:val="18"/>
-                <w:szCs w:val="18"/>
-              </w:rPr>
-              <w:t xml:space="preserve">Review tecnica critica</w:t>
-            </w:r>
-          </w:p>
-        </w:tc>
-        <w:tc>
-          <w:tcPr>
-            <w:tcW w:type="dxa" w:w="1500"/>
-            <w:tcBorders>
-              <w:top w:val="single" w:color="CBD6D3" w:sz="4"/>
-              <w:left w:val="single" w:color="CBD6D3" w:sz="4"/>
-              <w:bottom w:val="single" w:color="CBD6D3" w:sz="4"/>
-              <w:right w:val="single" w:color="CBD6D3" w:sz="4"/>
-            </w:tcBorders>
-            <w:tcMar>
-              <w:top w:type="dxa" w:w="100"/>
-              <w:left w:type="dxa" w:w="120"/>
-              <w:bottom w:type="dxa" w:w="100"/>
-              <w:right w:type="dxa" w:w="120"/>
-            </w:tcMar>
-            <w:vAlign w:val="top"/>
-          </w:tcPr>
-          <w:p>
-            <w:r>
-              <w:rPr>
-                <w:rFonts w:ascii="Consolas" w:cs="Consolas" w:eastAsia="Consolas" w:hAnsi="Consolas"/>
-                <w:b/>
-                <w:bCs/>
-                <w:color w:val="4C5F60"/>
-                <w:sz w:val="16"/>
-                <w:szCs w:val="16"/>
-              </w:rPr>
-              <w:t xml:space="preserve">CHIUSURA O RI-ETICHETTA</w:t>
-            </w:r>
-          </w:p>
-        </w:tc>
-        <w:tc>
-          <w:tcPr>
-            <w:tcW w:type="dxa" w:w="4360"/>
-            <w:tcBorders>
-              <w:top w:val="single" w:color="CBD6D3" w:sz="4"/>
-              <w:left w:val="single" w:color="CBD6D3" w:sz="4"/>
-              <w:bottom w:val="single" w:color="CBD6D3" w:sz="4"/>
-              <w:right w:val="single" w:color="CBD6D3" w:sz="4"/>
-            </w:tcBorders>
-            <w:tcMar>
-              <w:top w:type="dxa" w:w="100"/>
-              <w:left w:type="dxa" w:w="120"/>
-              <w:bottom w:type="dxa" w:w="100"/>
-              <w:right w:type="dxa" w:w="120"/>
-            </w:tcMar>
-            <w:vAlign w:val="top"/>
-          </w:tcPr>
-          <w:p>
-            <w:r>
-              <w:rPr>
-                <w:rFonts w:ascii="Georgia" w:cs="Georgia" w:eastAsia="Georgia" w:hAnsi="Georgia"/>
-                <w:color w:val="4C5F60"/>
-                <w:sz w:val="18"/>
-                <w:szCs w:val="18"/>
-              </w:rPr>
-              <w:t xml:space="preserve">Deliverable adottato integralmente dal piano di recupero. Chiudere, o etichettare come riferimento permanente.</w:t>
-            </w:r>
-          </w:p>
-        </w:tc>
-      </w:tr>
-      <w:tr>
-        <w:tc>
-          <w:tcPr>
-            <w:tcW w:type="dxa" w:w="900"/>
-            <w:tcBorders>
-              <w:top w:val="single" w:color="CBD6D3" w:sz="4"/>
-              <w:left w:val="single" w:color="CBD6D3" w:sz="4"/>
-              <w:bottom w:val="single" w:color="CBD6D3" w:sz="4"/>
-              <w:right w:val="single" w:color="CBD6D3" w:sz="4"/>
-            </w:tcBorders>
-            <w:tcMar>
-              <w:top w:type="dxa" w:w="100"/>
-              <w:left w:type="dxa" w:w="120"/>
-              <w:bottom w:type="dxa" w:w="100"/>
-              <w:right w:type="dxa" w:w="120"/>
-            </w:tcMar>
-            <w:vAlign w:val="top"/>
-          </w:tcPr>
-          <w:p>
-            <w:hyperlink w:history="1" r:id="rIdbupxtd-z-9s1pwiuivh2f">
+            <w:hyperlink w:history="1" r:id="rIdl_d4tid0y3g7dthqdiiyc">
               <w:r>
                 <w:rPr>
                   <w:rFonts w:ascii="Consolas" w:cs="Consolas" w:eastAsia="Consolas" w:hAnsi="Consolas"/>
@@ -3905,7 +3371,7 @@
                 <w:sz w:val="18"/>
                 <w:szCs w:val="18"/>
               </w:rPr>
-              <w:t xml:space="preserve">Vedi finding 04. Serve una decisione esplicita: chiudere come superata da param_first, o pianificare un E2E dedicato.</w:t>
+              <w:t xml:space="preserve">Vedi finding 03. Serve una decisione esplicita: chiudere come superata da param_first, o pianificare un E2E dedicato.</w:t>
             </w:r>
           </w:p>
         </w:tc>
@@ -3929,7 +3395,7 @@
             <w:vAlign w:val="top"/>
           </w:tcPr>
           <w:p>
-            <w:hyperlink w:history="1" r:id="rIdqhpolzj3qxngotwqm1nhw">
+            <w:hyperlink w:history="1" r:id="rIdsad93rh8otchk9bhhcrbr">
               <w:r>
                 <w:rPr>
                   <w:rFonts w:ascii="Consolas" w:cs="Consolas" w:eastAsia="Consolas" w:hAnsi="Consolas"/>
@@ -4052,7 +3518,7 @@
             <w:vAlign w:val="top"/>
           </w:tcPr>
           <w:p>
-            <w:hyperlink w:history="1" r:id="rIdsedsq4nnbrwfcidk-jp7c">
+            <w:hyperlink w:history="1" r:id="rIdumwyxzvb5miitc1autmuy">
               <w:r>
                 <w:rPr>
                   <w:rFonts w:ascii="Consolas" w:cs="Consolas" w:eastAsia="Consolas" w:hAnsi="Consolas"/>
@@ -4416,7 +3882,7 @@
           <w:sz w:val="22"/>
           <w:szCs w:val="22"/>
         </w:rPr>
-        <w:t xml:space="preserve">Quattro orizzonti, in ordine di esecuzione</w:t>
+        <w:t xml:space="preserve">Tre orizzonti, in ordine di esecuzione</w:t>
       </w:r>
     </w:p>
     <w:p>
@@ -4443,7 +3909,7 @@
           <w:sz w:val="22"/>
           <w:szCs w:val="22"/>
         </w:rPr>
-        <w:t xml:space="preserve">   Mitigare il rischio, non solo tracciarlo</w:t>
+        <w:t xml:space="preserve">   Mitigare il rischio, chiudere gli ultimi residui</w:t>
       </w:r>
     </w:p>
     <w:p>
@@ -4528,33 +3994,6 @@
     </w:p>
     <w:p>
       <w:pPr>
-        <w:spacing w:after="140" w:before="300"/>
-      </w:pPr>
-      <w:r>
-        <w:rPr>
-          <w:rFonts w:ascii="Consolas" w:cs="Consolas" w:eastAsia="Consolas" w:hAnsi="Consolas"/>
-          <w:b/>
-          <w:bCs/>
-          <w:color w:val="0E4A4F"/>
-          <w:sz w:val="15"/>
-          <w:szCs w:val="15"/>
-        </w:rPr>
-        <w:t xml:space="preserve">ORA — COSTO ~ZERO</w:t>
-      </w:r>
-      <w:r>
-        <w:rPr>
-          <w:rFonts w:ascii="Georgia" w:cs="Georgia" w:eastAsia="Georgia" w:hAnsi="Georgia"/>
-          <w:b/>
-          <w:bCs/>
-          <w:color w:val="17262A"/>
-          <w:sz w:val="22"/>
-          <w:szCs w:val="22"/>
-        </w:rPr>
-        <w:t xml:space="preserve">   Igiene di piano, i residui</w:t>
-      </w:r>
-    </w:p>
-    <w:p>
-      <w:pPr>
         <w:pBdr>
           <w:left w:val="single" w:color="1B6E73" w:sz="18" w:space="8"/>
         </w:pBdr>
@@ -4581,7 +4020,7 @@
           <w:sz w:val="19"/>
           <w:szCs w:val="19"/>
         </w:rPr>
-        <w:t xml:space="preserve">Chiudere formalmente #15, #17, #18, #19</w:t>
+        <w:t xml:space="preserve">Estendere la mappa documenti di CLAUDE.md</w:t>
       </w:r>
       <w:r>
         <w:rPr>
@@ -4590,7 +4029,7 @@
           <w:sz w:val="19"/>
           <w:szCs w:val="19"/>
         </w:rPr>
-        <w:t xml:space="preserve"> su GitHub con riferimento ai PR di merge — invariato dalla revisione precedente.</w:t>
+        <w:t xml:space="preserve"> con una riga per M7/Prompt to Part (logbook_fase7.md, report_m7_run0.md, dashboard app.py, issue #35).</w:t>
       </w:r>
     </w:p>
     <w:p>
@@ -4621,7 +4060,7 @@
           <w:sz w:val="19"/>
           <w:szCs w:val="19"/>
         </w:rPr>
-        <w:t xml:space="preserve">Estendere la mappa documenti di CLAUDE.md</w:t>
+        <w:t xml:space="preserve">Sciogliere #4</w:t>
       </w:r>
       <w:r>
         <w:rPr>
@@ -4630,7 +4069,34 @@
           <w:sz w:val="19"/>
           <w:szCs w:val="19"/>
         </w:rPr>
-        <w:t xml:space="preserve"> con una riga per M7/Prompt to Part (logbook_fase7.md, report_m7_run0.md, dashboard app.py, issue #35).</w:t>
+        <w:t xml:space="preserve"> con una decisione esplicita — superata da param_first (confermato in M6 e M7), oppure pianificato un E2E sketch-first dedicato.</w:t>
+      </w:r>
+    </w:p>
+    <w:p>
+      <w:pPr>
+        <w:spacing w:after="140" w:before="300"/>
+      </w:pPr>
+      <w:r>
+        <w:rPr>
+          <w:rFonts w:ascii="Consolas" w:cs="Consolas" w:eastAsia="Consolas" w:hAnsi="Consolas"/>
+          <w:b/>
+          <w:bCs/>
+          <w:color w:val="0E4A4F"/>
+          <w:sz w:val="15"/>
+          <w:szCs w:val="15"/>
+        </w:rPr>
+        <w:t xml:space="preserve">SUBITO — NESSUN GATE RESIDUO</w:t>
+      </w:r>
+      <w:r>
+        <w:rPr>
+          <w:rFonts w:ascii="Georgia" w:cs="Georgia" w:eastAsia="Georgia" w:hAnsi="Georgia"/>
+          <w:b/>
+          <w:bCs/>
+          <w:color w:val="17262A"/>
+          <w:sz w:val="22"/>
+          <w:szCs w:val="22"/>
+        </w:rPr>
+        <w:t xml:space="preserve">   Avvio M8, e gli ultimi migli</w:t>
       </w:r>
     </w:p>
     <w:p>
@@ -4661,7 +4127,7 @@
           <w:sz w:val="19"/>
           <w:szCs w:val="19"/>
         </w:rPr>
-        <w:t xml:space="preserve">Sciogliere #4</w:t>
+        <w:t xml:space="preserve">Avviare la parte documentale di M8</w:t>
       </w:r>
       <w:r>
         <w:rPr>
@@ -4670,34 +4136,7 @@
           <w:sz w:val="19"/>
           <w:szCs w:val="19"/>
         </w:rPr>
-        <w:t xml:space="preserve"> con una decisione esplicita — superata da param_first (confermato in M6 e M7), oppure pianificato un E2E sketch-first dedicato.</w:t>
-      </w:r>
-    </w:p>
-    <w:p>
-      <w:pPr>
-        <w:spacing w:after="140" w:before="300"/>
-      </w:pPr>
-      <w:r>
-        <w:rPr>
-          <w:rFonts w:ascii="Consolas" w:cs="Consolas" w:eastAsia="Consolas" w:hAnsi="Consolas"/>
-          <w:b/>
-          <w:bCs/>
-          <w:color w:val="0E4A4F"/>
-          <w:sz w:val="15"/>
-          <w:szCs w:val="15"/>
-        </w:rPr>
-        <w:t xml:space="preserve">SUBITO — NESSUN GATE RESIDUO</w:t>
-      </w:r>
-      <w:r>
-        <w:rPr>
-          <w:rFonts w:ascii="Georgia" w:cs="Georgia" w:eastAsia="Georgia" w:hAnsi="Georgia"/>
-          <w:b/>
-          <w:bCs/>
-          <w:color w:val="17262A"/>
-          <w:sz w:val="22"/>
-          <w:szCs w:val="22"/>
-        </w:rPr>
-        <w:t xml:space="preserve">   Avvio M8, e gli ultimi migli</w:t>
+        <w:t xml:space="preserve"> (#20): schema formale del Livello 6, validatore, bootstrap retroattivo — nessuna dipendenza tecnica residua ora che M7 è chiusa.</w:t>
       </w:r>
     </w:p>
     <w:p>
@@ -4728,7 +4167,7 @@
           <w:sz w:val="19"/>
           <w:szCs w:val="19"/>
         </w:rPr>
-        <w:t xml:space="preserve">Avviare la parte documentale di M8</w:t>
+        <w:t xml:space="preserve">Ricalibrare CALIPER_CPU_LIMIT_S</w:t>
       </w:r>
       <w:r>
         <w:rPr>
@@ -4737,7 +4176,7 @@
           <w:sz w:val="19"/>
           <w:szCs w:val="19"/>
         </w:rPr>
-        <w:t xml:space="preserve"> (#20): schema formale del Livello 6, validatore, bootstrap retroattivo — nessuna dipendenza tecnica residua ora che M7 è chiusa.</w:t>
+        <w:t xml:space="preserve"> sul caso pesante (E2E-3, pitch=0.05), non solo sul caso base — stesso “ultimo miglio” già chiuso per GAUGE_CHECK_CPU_LIMIT_SECONDS in M6.</w:t>
       </w:r>
     </w:p>
     <w:p>
@@ -4768,7 +4207,7 @@
           <w:sz w:val="19"/>
           <w:szCs w:val="19"/>
         </w:rPr>
-        <w:t xml:space="preserve">Ricalibrare CALIPER_CPU_LIMIT_S</w:t>
+        <w:t xml:space="preserve">Pubblicare l'immagine Flowise patchata su GHCR</w:t>
       </w:r>
       <w:r>
         <w:rPr>
@@ -4777,7 +4216,7 @@
           <w:sz w:val="19"/>
           <w:szCs w:val="19"/>
         </w:rPr>
-        <w:t xml:space="preserve"> sul caso pesante (E2E-3, pitch=0.05), non solo sul caso base — stesso “ultimo miglio” già chiuso per GAUGE_CHECK_CPU_LIMIT_SECONDS in M6.</w:t>
+        <w:t xml:space="preserve"> se si vuole un docker-compose.ghcr.yml completo — oggi publish-images.yml pubblica solo le 4 immagini di servizio.</w:t>
       </w:r>
     </w:p>
     <w:p>
@@ -4808,7 +4247,7 @@
           <w:sz w:val="19"/>
           <w:szCs w:val="19"/>
         </w:rPr>
-        <w:t xml:space="preserve">Pubblicare l'immagine Flowise patchata su GHCR</w:t>
+        <w:t xml:space="preserve">Ri-eseguire il bench modelli L2.5</w:t>
       </w:r>
       <w:r>
         <w:rPr>
@@ -4817,7 +4256,34 @@
           <w:sz w:val="19"/>
           <w:szCs w:val="19"/>
         </w:rPr>
-        <w:t xml:space="preserve"> se si vuole un docker-compose.ghcr.yml completo — oggi publish-images.yml pubblica solo le 4 immagini di servizio.</w:t>
+        <w:t xml:space="preserve"> sullo schema tolerance_type corretto prima di scegliere il modello di produzione.</w:t>
+      </w:r>
+    </w:p>
+    <w:p>
+      <w:pPr>
+        <w:spacing w:after="140" w:before="300"/>
+      </w:pPr>
+      <w:r>
+        <w:rPr>
+          <w:rFonts w:ascii="Consolas" w:cs="Consolas" w:eastAsia="Consolas" w:hAnsi="Consolas"/>
+          <w:b/>
+          <w:bCs/>
+          <w:color w:val="0E4A4F"/>
+          <w:sz w:val="15"/>
+          <w:szCs w:val="15"/>
+        </w:rPr>
+        <w:t xml:space="preserve">MEDIO TERMINE</w:t>
+      </w:r>
+      <w:r>
+        <w:rPr>
+          <w:rFonts w:ascii="Georgia" w:cs="Georgia" w:eastAsia="Georgia" w:hAnsi="Georgia"/>
+          <w:b/>
+          <w:bCs/>
+          <w:color w:val="17262A"/>
+          <w:sz w:val="22"/>
+          <w:szCs w:val="22"/>
+        </w:rPr>
+        <w:t xml:space="preserve">   M8 fisica, dominio geometrico, resto del backlog</w:t>
       </w:r>
     </w:p>
     <w:p>
@@ -4848,7 +4314,7 @@
           <w:sz w:val="19"/>
           <w:szCs w:val="19"/>
         </w:rPr>
-        <w:t xml:space="preserve">Ri-eseguire il bench modelli L2.5</w:t>
+        <w:t xml:space="preserve">Primo lotto fisico</w:t>
       </w:r>
       <w:r>
         <w:rPr>
@@ -4857,34 +4323,7 @@
           <w:sz w:val="19"/>
           <w:szCs w:val="19"/>
         </w:rPr>
-        <w:t xml:space="preserve"> sullo schema tolerance_type corretto prima di scegliere il modello di produzione.</w:t>
-      </w:r>
-    </w:p>
-    <w:p>
-      <w:pPr>
-        <w:spacing w:after="140" w:before="300"/>
-      </w:pPr>
-      <w:r>
-        <w:rPr>
-          <w:rFonts w:ascii="Consolas" w:cs="Consolas" w:eastAsia="Consolas" w:hAnsi="Consolas"/>
-          <w:b/>
-          <w:bCs/>
-          <w:color w:val="0E4A4F"/>
-          <w:sz w:val="15"/>
-          <w:szCs w:val="15"/>
-        </w:rPr>
-        <w:t xml:space="preserve">MEDIO TERMINE</w:t>
-      </w:r>
-      <w:r>
-        <w:rPr>
-          <w:rFonts w:ascii="Georgia" w:cs="Georgia" w:eastAsia="Georgia" w:hAnsi="Georgia"/>
-          <w:b/>
-          <w:bCs/>
-          <w:color w:val="17262A"/>
-          <w:sz w:val="22"/>
-          <w:szCs w:val="22"/>
-        </w:rPr>
-        <w:t xml:space="preserve">   M8 fisica, dominio geometrico, resto del backlog</w:t>
+        <w:t xml:space="preserve"> con l'utente — stampa dei pezzi PASS-virtuali (M6/M7 ne hanno già uno, e2e2_thread_M6.gcode), misura al calibro, prima misura di concordanza virtuale↔fisico.</w:t>
       </w:r>
     </w:p>
     <w:p>
@@ -4915,7 +4354,7 @@
           <w:sz w:val="19"/>
           <w:szCs w:val="19"/>
         </w:rPr>
-        <w:t xml:space="preserve">Primo lotto fisico</w:t>
+        <w:t xml:space="preserve">Portare issue #36 a revisione con l'utente</w:t>
       </w:r>
       <w:r>
         <w:rPr>
@@ -4924,7 +4363,7 @@
           <w:sz w:val="19"/>
           <w:szCs w:val="19"/>
         </w:rPr>
-        <w:t xml:space="preserve"> con l'utente — stampa dei pezzi PASS-virtuali (M6/M7 ne hanno già uno, e2e2_thread_M6.gcode), misura al calibro, prima misura di concordanza virtuale↔fisico.</w:t>
+        <w:t xml:space="preserve"> — le 4 domande sono ben poste; nessuna richiede risposta oggi, ma una priorità sì, prima che diventi un altro vincolo “temporaneo” permanente come lo scope M3.</w:t>
       </w:r>
     </w:p>
     <w:p>
@@ -4955,46 +4394,6 @@
           <w:sz w:val="19"/>
           <w:szCs w:val="19"/>
         </w:rPr>
-        <w:t xml:space="preserve">Portare issue #36 a revisione con l'utente</w:t>
-      </w:r>
-      <w:r>
-        <w:rPr>
-          <w:rFonts w:ascii="Georgia" w:cs="Georgia" w:eastAsia="Georgia" w:hAnsi="Georgia"/>
-          <w:color w:val="17262A"/>
-          <w:sz w:val="19"/>
-          <w:szCs w:val="19"/>
-        </w:rPr>
-        <w:t xml:space="preserve"> — le 4 domande sono ben poste; nessuna richiede risposta oggi, ma una priorità sì, prima che diventi un altro vincolo “temporaneo” permanente come lo scope M3.</w:t>
-      </w:r>
-    </w:p>
-    <w:p>
-      <w:pPr>
-        <w:pBdr>
-          <w:left w:val="single" w:color="1B6E73" w:sz="18" w:space="8"/>
-        </w:pBdr>
-        <w:spacing w:after="100"/>
-        <w:ind w:left="260"/>
-      </w:pPr>
-      <w:r>
-        <w:rPr>
-          <w:rFonts w:ascii="Consolas" w:cs="Consolas" w:eastAsia="Consolas" w:hAnsi="Consolas"/>
-          <w:b/>
-          <w:bCs/>
-          <w:color w:val="1B6E73"/>
-          <w:sz w:val="19"/>
-          <w:szCs w:val="19"/>
-        </w:rPr>
-        <w:t xml:space="preserve">12.  </w:t>
-      </w:r>
-      <w:r>
-        <w:rPr>
-          <w:rFonts w:ascii="Georgia" w:cs="Georgia" w:eastAsia="Georgia" w:hAnsi="Georgia"/>
-          <w:b/>
-          <w:bCs/>
-          <w:color w:val="17262A"/>
-          <w:sz w:val="19"/>
-          <w:szCs w:val="19"/>
-        </w:rPr>
         <w:t xml:space="preserve">Pianificare issue #10</w:t>
       </w:r>
       <w:r>
@@ -5044,7 +4443,7 @@
           <w:sz w:val="15"/>
           <w:szCs w:val="15"/>
         </w:rPr>
-        <w:t xml:space="preserve">Basata su: README.md · CLAUDE.md · CHANGELOG.md · docs/*.md (18 documenti, incl. logbook_fase7.md, report_m7_run0.md) · services/dashboard/app.py · PR #31-34 · issue #1-#36 (14 esistenti) · log commit develop @ f53d3e7 — rev.3 di questa review, prima versione 2026-08-25 mattina</w:t>
+        <w:t xml:space="preserve">Basata su: README.md · CLAUDE.md · CHANGELOG.md · docs/*.md (18 documenti, incl. logbook_fase7.md, report_m7_run0.md) · services/dashboard/app.py · PR #31-34 · issue #1-#36 (14 esistenti, 6 aperte) · log commit develop @ f53d3e7 — rev.4 di questa review, prima versione 2026-08-25 mattina</w:t>
       </w:r>
     </w:p>
     <w:sectPr>

</xml_diff>